<commit_message>
Publish feature galleries, interactive social demo, AI results and updated BRI PDF resumes
</commit_message>
<xml_diff>
--- a/site/resume/Doddie-Prawarjito-EN.docx
+++ b/site/resume/Doddie-Prawarjito-EN.docx
@@ -16,20 +16,26 @@
       <w:pPr>
         <w:keepNext/>
         <w:keepLines/>
+        <w:spacing w:after="60"/>
       </w:pPr>
       <w:r>
         <w:rPr>
           <w:b/>
+          <w:sz w:val="21"/>
         </w:rPr>
-        <w:t>Software Developer | Business Applications and Web Development</w:t>
+        <w:t>Software Engineer | C#/.NET Backend and SQL Server</w:t>
       </w:r>
     </w:p>
     <w:p>
       <w:pPr>
         <w:keepNext/>
         <w:keepLines/>
+        <w:spacing w:after="60"/>
       </w:pPr>
       <w:r>
+        <w:rPr>
+          <w:sz w:val="21"/>
+        </w:rPr>
         <w:t>Tangerang Selatan, Banten | +62 858-8069-5449 | doddiepvroh@gmail.com</w:t>
       </w:r>
     </w:p>
@@ -37,10 +43,28 @@
       <w:pPr>
         <w:keepNext w:val="0"/>
         <w:keepLines/>
+        <w:spacing w:after="60"/>
       </w:pPr>
       <w:r>
+        <w:rPr>
+          <w:sz w:val="21"/>
+        </w:rPr>
         <w:t>linkedin.com/in/doddie-prawarjito</w:t>
       </w:r>
+      <w:r>
+        <w:rPr>
+          <w:sz w:val="21"/>
+        </w:rPr>
+        <w:t xml:space="preserve"> | Portfolio: </w:t>
+      </w:r>
+      <w:hyperlink r:id="rId9">
+        <w:r>
+          <w:rPr>
+            <w:sz w:val="21"/>
+          </w:rPr>
+          <w:t>mrrobotdude.github.io</w:t>
+        </w:r>
+      </w:hyperlink>
     </w:p>
     <w:p>
       <w:pPr>
@@ -58,7 +82,7 @@
         <w:keepLines/>
       </w:pPr>
       <w:r>
-        <w:t>Software developer translating user requirements into business applications, web interfaces, and system integrations. Experience spans C#/.NET and SQL Server development, payroll and HR workflows, frontend delivery, technical support, and programming instruction. Combines hands-on implementation with database performance improvement, calculation validation, and clear technical documentation.</w:t>
+        <w:t>Software engineer developing C#/.NET applications and API integrations for payroll, attendance, and internal operations. Experience includes SQL Server performance optimization, client payroll calculations validated with HR, and backend delivery for device integrations and a client-used chatbot.</w:t>
       </w:r>
     </w:p>
     <w:p>
@@ -113,7 +137,7 @@
         <w:t xml:space="preserve">Web: </w:t>
       </w:r>
       <w:r>
-        <w:t>React, JavaScript, PHP, Laravel Blade, HTML, CSS, Bootstrap</w:t>
+        <w:t>React, JavaScript, HTML, CSS, Bootstrap</w:t>
       </w:r>
     </w:p>
     <w:p>
@@ -143,7 +167,7 @@
         <w:t xml:space="preserve">Engineering practice: </w:t>
       </w:r>
       <w:r>
-        <w:t>Requirements analysis, debugging, unit testing, QA collaboration, system integration testing (SIT), technical documentation</w:t>
+        <w:t>Unit testing, QA collaboration, system integration testing (SIT), requirements analysis</w:t>
       </w:r>
     </w:p>
     <w:p>
@@ -226,26 +250,6 @@
         <w:keepLines/>
       </w:pPr>
       <w:r>
-        <w:t>Built HR performance scoring, goal calculations, attendance integration, and configurable questionnaire distribution, enabling HR to monitor goal progress and review supporting evidence.</w:t>
-      </w:r>
-    </w:p>
-    <w:p>
-      <w:pPr>
-        <w:pStyle w:val="ListBullet"/>
-        <w:keepNext w:val="0"/>
-        <w:keepLines/>
-      </w:pPr>
-      <w:r>
-        <w:t>Translated Benemica Employee Self-Service (ESS) user requirements into attendance, leave, overtime, and shift features, applying client-specific business rules while preserving behavior for unaffected clients.</w:t>
-      </w:r>
-    </w:p>
-    <w:p>
-      <w:pPr>
-        <w:pStyle w:val="ListBullet"/>
-        <w:keepNext w:val="0"/>
-        <w:keepLines/>
-      </w:pPr>
-      <w:r>
         <w:t>Investigated defects, wrote unit tests, collaborated with QA, and supported development and SIT deployments; used AWS EC2 for servers, S3 for images and knowledge-base storage, and Cognito for authentication.</w:t>
       </w:r>
     </w:p>
@@ -254,7 +258,7 @@
         <w:pStyle w:val="Heading2"/>
         <w:keepNext/>
         <w:keepLines/>
-        <w:pageBreakBefore/>
+        <w:pageBreakBefore w:val="0"/>
       </w:pPr>
       <w:r>
         <w:t>PT. Alam Tehnik Semesta</w:t>
@@ -323,7 +327,7 @@
         <w:keepLines/>
       </w:pPr>
       <w:r>
-        <w:t>Created technical documentation and user guides and supported internal users with application and hardware issues.</w:t>
+        <w:t>Created technical documentation and user guides and supported internal application users.</w:t>
       </w:r>
     </w:p>
     <w:p>
@@ -356,17 +360,7 @@
         <w:keepLines/>
       </w:pPr>
       <w:r>
-        <w:t>Developed .NET backend and React frontend features for an academic-writing and revision-tracking pilot used by a professor, supporting collaboration between students and supervisors.</w:t>
-      </w:r>
-    </w:p>
-    <w:p>
-      <w:pPr>
-        <w:pStyle w:val="ListBullet"/>
-        <w:keepNext w:val="0"/>
-        <w:keepLines/>
-      </w:pPr>
-      <w:r>
-        <w:t>Integrated frontend components with .NET APIs and handed over the pilot for continued development by the next intern team.</w:t>
+        <w:t>Developed .NET backend and React frontend features for an academic-writing and revision-tracking pilot used by a professor; handed over continued development to the next intern team.</w:t>
       </w:r>
     </w:p>
     <w:p>
@@ -411,7 +405,7 @@
         <w:rPr>
           <w:i/>
         </w:rPr>
-        <w:t>Concurrent freelance project</w:t>
+        <w:t>Concurrent project with maintenance and further development as needed</w:t>
       </w:r>
     </w:p>
     <w:p>
@@ -421,17 +415,7 @@
         <w:keepLines/>
       </w:pPr>
       <w:r>
-        <w:t>Built frontend interfaces and integrated partner-developed APIs for a live automotive website using Laravel Blade, consolidating vehicle listings across branches.</w:t>
-      </w:r>
-    </w:p>
-    <w:p>
-      <w:pPr>
-        <w:pStyle w:val="ListBullet"/>
-        <w:keepNext w:val="0"/>
-        <w:keepLines/>
-      </w:pPr>
-      <w:r>
-        <w:t>Implemented vehicle search and filtering, marketing referral tracking, and employee and role administration interfaces; remain available for maintenance and further development.</w:t>
+        <w:t>Built the frontend and integrated partner-developed APIs for a live automotive website consolidating vehicle listings across branches, with search, filtering, referral tracking, and administration interfaces.</w:t>
       </w:r>
     </w:p>
     <w:p>
@@ -474,17 +458,7 @@
         <w:keepLines/>
       </w:pPr>
       <w:r>
-        <w:t>Led SQL and Java Swing programming labs and evaluated student assignments and practical examinations.</w:t>
-      </w:r>
-    </w:p>
-    <w:p>
-      <w:pPr>
-        <w:pStyle w:val="ListBullet"/>
-        <w:keepNext w:val="0"/>
-        <w:keepLines/>
-      </w:pPr>
-      <w:r>
-        <w:t>Created reusable teaching and training materials, helped prepare examinations, and trained new laboratory assistants.</w:t>
+        <w:t>Led SQL and Java Swing programming labs, assessed assignments and practical examinations, created reusable teaching materials, and trained new laboratory assistants.</w:t>
       </w:r>
     </w:p>
     <w:p>
@@ -540,21 +514,12 @@
         <w:keepLines/>
       </w:pPr>
       <w:r>
-        <w:t>Digital Transformation | Simplilearn | April 2025</w:t>
-      </w:r>
-    </w:p>
-    <w:p>
-      <w:pPr>
-        <w:keepNext w:val="0"/>
-        <w:keepLines/>
-      </w:pPr>
-      <w:r>
         <w:t>IT Bootcamp Program - Cyber Security | Bina Nusantara University | August 2025</w:t>
       </w:r>
     </w:p>
     <w:sectPr>
-      <w:pgSz w:w="11909" w:h="16834"/>
-      <w:pgMar w:top="936" w:right="1008" w:bottom="936" w:left="1008" w:header="720" w:footer="720" w:gutter="0"/>
+      <w:pgSz w:w="11906" w:h="16838"/>
+      <w:pgMar w:top="1020" w:right="1020" w:bottom="1020" w:left="1020" w:header="454" w:footer="454" w:gutter="0"/>
       <w:cols w:space="720"/>
       <w:docGrid w:linePitch="360"/>
     </w:sectPr>
@@ -928,12 +893,12 @@
     <w:pPr>
       <w:keepNext w:val="0"/>
       <w:widowControl/>
-      <w:spacing w:after="60" w:line="247" w:lineRule="auto" w:before="0"/>
+      <w:spacing w:after="80" w:line="254" w:lineRule="auto" w:before="0"/>
     </w:pPr>
     <w:rPr>
       <w:rFonts w:ascii="Calibri" w:hAnsi="Calibri"/>
       <w:color w:val="000000"/>
-      <w:sz w:val="22"/>
+      <w:sz w:val="24"/>
       <w:lang w:val="en-US"/>
     </w:rPr>
   </w:style>
@@ -993,7 +958,7 @@
       <w:keepNext/>
       <w:keepLines/>
       <w:widowControl/>
-      <w:spacing w:before="140" w:after="60" w:line="247" w:lineRule="auto"/>
+      <w:spacing w:before="180" w:after="80" w:line="254" w:lineRule="auto"/>
       <w:outlineLvl w:val="0"/>
     </w:pPr>
     <w:rPr>
@@ -1001,7 +966,7 @@
       <w:b/>
       <w:bCs/>
       <w:color w:val="000000"/>
-      <w:sz w:val="24"/>
+      <w:sz w:val="26"/>
       <w:szCs w:val="28"/>
     </w:rPr>
   </w:style>
@@ -1018,7 +983,7 @@
       <w:keepNext/>
       <w:keepLines/>
       <w:widowControl/>
-      <w:spacing w:before="80" w:after="60" w:line="247" w:lineRule="auto"/>
+      <w:spacing w:before="120" w:after="80" w:line="254" w:lineRule="auto"/>
       <w:outlineLvl w:val="1"/>
     </w:pPr>
     <w:rPr>
@@ -1026,7 +991,7 @@
       <w:b/>
       <w:bCs/>
       <w:color w:val="000000"/>
-      <w:sz w:val="22"/>
+      <w:sz w:val="24"/>
       <w:szCs w:val="26"/>
     </w:rPr>
   </w:style>
@@ -1282,7 +1247,7 @@
     <w:pPr>
       <w:keepNext/>
       <w:widowControl/>
-      <w:spacing w:after="60" w:line="247" w:lineRule="auto" w:before="0"/>
+      <w:spacing w:after="80" w:line="254" w:lineRule="auto" w:before="0"/>
       <w:contextualSpacing/>
     </w:pPr>
     <w:rPr>
@@ -1291,7 +1256,7 @@
       <w:color w:val="000000"/>
       <w:spacing w:val="5"/>
       <w:kern w:val="28"/>
-      <w:sz w:val="38"/>
+      <w:sz w:val="42"/>
       <w:szCs w:val="52"/>
     </w:rPr>
   </w:style>
@@ -1467,14 +1432,14 @@
       <w:numPr>
         <w:numId w:val="1"/>
       </w:numPr>
-      <w:spacing w:after="60" w:line="247" w:lineRule="auto" w:before="0"/>
+      <w:spacing w:after="80" w:line="254" w:lineRule="auto" w:before="0"/>
       <w:ind w:left="220" w:hanging="140"/>
       <w:contextualSpacing/>
     </w:pPr>
     <w:rPr>
       <w:rFonts w:ascii="Calibri" w:hAnsi="Calibri"/>
       <w:color w:val="000000"/>
-      <w:sz w:val="22"/>
+      <w:sz w:val="24"/>
     </w:rPr>
   </w:style>
   <w:style w:type="paragraph" w:styleId="ListBullet2">

</xml_diff>